<commit_message>
docs: separar claramente QUE HACER vs QUE DECIR en el guion del video
</commit_message>
<xml_diff>
--- a/docs/guion_video_actividad9.docx
+++ b/docs/guion_video_actividad9.docx
@@ -618,7 +618,81 @@
         <w:pStyle w:val="Heading2"/>
       </w:pPr>
       <w:r>
+        <w:t>Cómo leer cada sección de aquí en adelante</w:t>
+      </w:r>
+    </w:p>
+    <w:p>
+      <w:r>
+        <w:t>Cada parte del guion tiene dos bloques, siempre en el mismo orden:</w:t>
+      </w:r>
+    </w:p>
+    <w:p>
+      <w:pPr>
+        <w:pStyle w:val="ListBullet"/>
+      </w:pPr>
+      <w:r>
+        <w:rPr>
+          <w:b/>
+        </w:rPr>
+        <w:t>🎬 QUÉ HACER</w:t>
+      </w:r>
+      <w:r>
+        <w:t xml:space="preserve"> → son instrucciones para ti, el operador (dónde hacer clic, qué mostrar en pantalla). </w:t>
+      </w:r>
+      <w:r>
+        <w:rPr>
+          <w:b/>
+        </w:rPr>
+        <w:t>Esto NO se dice en voz alta</w:t>
+      </w:r>
+      <w:r>
+        <w:t>, es solo tu guía visual mientras grabas.</w:t>
+      </w:r>
+    </w:p>
+    <w:p>
+      <w:pPr>
+        <w:pStyle w:val="ListBullet"/>
+      </w:pPr>
+      <w:r>
+        <w:rPr>
+          <w:b/>
+        </w:rPr>
+        <w:t>🗣️ QUÉ DECIR</w:t>
+      </w:r>
+      <w:r>
+        <w:t xml:space="preserve"> → es el texto entre comillas que sí hablas frente a la cámara, con tus propias palabras (no hace falta memorizarlo exacto, solo la idea).</w:t>
+      </w:r>
+    </w:p>
+    <w:p>
+      <w:pPr>
+        <w:pStyle w:val="Heading2"/>
+      </w:pPr>
+      <w:r>
         <w:t>1. Introducción (30-40 seg)</w:t>
+      </w:r>
+    </w:p>
+    <w:p>
+      <w:r>
+        <w:rPr>
+          <w:b/>
+        </w:rPr>
+        <w:t>🎬 QUÉ HACER:</w:t>
+      </w:r>
+    </w:p>
+    <w:p>
+      <w:pPr>
+        <w:pStyle w:val="ListBullet"/>
+      </w:pPr>
+      <w:r>
+        <w:t>Cámara/rostro visible en pantalla completa (sin compartir aún ninguna ventana de código o navegador).</w:t>
+      </w:r>
+    </w:p>
+    <w:p>
+      <w:r>
+        <w:rPr>
+          <w:b/>
+        </w:rPr>
+        <w:t>🗣️ QUÉ DECIR:</w:t>
       </w:r>
     </w:p>
     <w:p>
@@ -633,16 +707,35 @@
       </w:r>
     </w:p>
     <w:p>
-      <w:r>
-        <w:t>(Muestra tu rostro a cámara durante esta parte, como pide la guía.)</w:t>
-      </w:r>
-    </w:p>
-    <w:p>
       <w:pPr>
         <w:pStyle w:val="Heading2"/>
       </w:pPr>
       <w:r>
         <w:t>2. Arquitectura general (1 min)</w:t>
+      </w:r>
+    </w:p>
+    <w:p>
+      <w:r>
+        <w:rPr>
+          <w:b/>
+        </w:rPr>
+        <w:t>🎬 QUÉ HACER:</w:t>
+      </w:r>
+    </w:p>
+    <w:p>
+      <w:pPr>
+        <w:pStyle w:val="ListBullet"/>
+      </w:pPr>
+      <w:r>
+        <w:t>Puedes seguir con tu rostro en pantalla completa, o si tienes un diagrama simple dibujado (Frontend en Vercel → API REST en Render → MongoDB Atlas), muéstralo ahora. No es obligatorio, es opcional.</w:t>
+      </w:r>
+    </w:p>
+    <w:p>
+      <w:r>
+        <w:rPr>
+          <w:b/>
+        </w:rPr>
+        <w:t>🗣️ QUÉ DECIR:</w:t>
       </w:r>
     </w:p>
     <w:p>
@@ -653,113 +746,7 @@
         <w:rPr>
           <w:i/>
         </w:rPr>
-        <w:t>"El sistema tiene tres capas desplegadas de forma independiente en la nube:</w:t>
-      </w:r>
-    </w:p>
-    <w:p>
-      <w:pPr>
-        <w:ind w:left="400"/>
-      </w:pPr>
-      <w:r>
-        <w:rPr>
-          <w:i/>
-        </w:rPr>
-        <w:t xml:space="preserve">- El </w:t>
-      </w:r>
-      <w:r>
-        <w:rPr>
-          <w:b/>
-          <w:i/>
-        </w:rPr>
-        <w:t>frontend</w:t>
-      </w:r>
-      <w:r>
-        <w:rPr>
-          <w:i/>
-        </w:rPr>
-        <w:t>, una SPA (Single Page Application) hecha en HTML, CSS y JavaScript puro, organizada en tres componentes: Dashboard, Formulario y Lista de tickets.</w:t>
-      </w:r>
-    </w:p>
-    <w:p>
-      <w:pPr>
-        <w:ind w:left="400"/>
-      </w:pPr>
-      <w:r>
-        <w:rPr>
-          <w:i/>
-        </w:rPr>
-        <w:t xml:space="preserve">- El </w:t>
-      </w:r>
-      <w:r>
-        <w:rPr>
-          <w:b/>
-          <w:i/>
-        </w:rPr>
-        <w:t>backend</w:t>
-      </w:r>
-      <w:r>
-        <w:rPr>
-          <w:i/>
-        </w:rPr>
-        <w:t>, una API REST construida con Node.js y Express, que expone operaciones CRUD para los tickets.</w:t>
-      </w:r>
-    </w:p>
-    <w:p>
-      <w:pPr>
-        <w:ind w:left="400"/>
-      </w:pPr>
-      <w:r>
-        <w:rPr>
-          <w:i/>
-        </w:rPr>
-        <w:t xml:space="preserve">- La </w:t>
-      </w:r>
-      <w:r>
-        <w:rPr>
-          <w:b/>
-          <w:i/>
-        </w:rPr>
-        <w:t>base de datos</w:t>
-      </w:r>
-      <w:r>
-        <w:rPr>
-          <w:i/>
-        </w:rPr>
-        <w:t>, en MongoDB Atlas, en la nube, sin depender de ningún servidor local.</w:t>
-      </w:r>
-    </w:p>
-    <w:p>
-      <w:r>
-        <w:t>&gt;</w:t>
-      </w:r>
-    </w:p>
-    <w:p>
-      <w:pPr>
-        <w:ind w:left="400"/>
-      </w:pPr>
-      <w:r>
-        <w:rPr>
-          <w:i/>
-        </w:rPr>
-        <w:t xml:space="preserve">El frontend consume la API mediante peticiones HTTP asíncronas mediante </w:t>
-      </w:r>
-      <w:r>
-        <w:rPr>
-          <w:rFonts w:ascii="Consolas" w:hAnsi="Consolas"/>
-          <w:i/>
-        </w:rPr>
-        <w:t>fetch</w:t>
-      </w:r>
-      <w:r>
-        <w:rPr>
-          <w:i/>
-        </w:rPr>
-        <w:t>, y la API se comunica con MongoDB Atlas mediante Mongoose."</w:t>
-      </w:r>
-    </w:p>
-    <w:p>
-      <w:r>
-        <w:t>(Aquí puedes mostrar un diagrama simple: Frontend (Vercel) → API REST (Render) → MongoDB Atlas.)</w:t>
+        <w:t>"El sistema tiene tres capas desplegadas de forma independiente en la nube: el frontend, una SPA hecha en HTML, CSS y JavaScript puro, organizada en tres componentes — Dashboard, Formulario y Lista de tickets; el backend, una API REST construida con Node.js y Express, que expone operaciones CRUD para los tickets; y la base de datos, en MongoDB Atlas, en la nube, sin depender de ningún servidor local. El frontend consume la API mediante peticiones HTTP asíncronas con fetch, y la API se comunica con MongoDB Atlas mediante Mongoose."</w:t>
       </w:r>
     </w:p>
     <w:p>
@@ -772,162 +759,131 @@
     </w:p>
     <w:p>
       <w:r>
-        <w:t>Abre tu editor de código (VS Code) y muestra:</w:t>
+        <w:rPr>
+          <w:b/>
+        </w:rPr>
+        <w:t>🎬 QUÉ HACER:</w:t>
       </w:r>
     </w:p>
     <w:p>
       <w:pPr>
-        <w:pStyle w:val="ListNumber"/>
+        <w:pStyle w:val="ListBullet"/>
       </w:pPr>
+      <w:r>
+        <w:t xml:space="preserve">Cambia a la ventana de </w:t>
+      </w:r>
       <w:r>
         <w:rPr>
           <w:b/>
         </w:rPr>
-        <w:t>Backend</w:t>
+        <w:t>VS Code</w:t>
       </w:r>
       <w:r>
-        <w:t xml:space="preserve"> (</w:t>
+        <w:t>.</w:t>
+      </w:r>
+    </w:p>
+    <w:p>
+      <w:pPr>
+        <w:pStyle w:val="ListBullet"/>
+      </w:pPr>
+      <w:r>
+        <w:t xml:space="preserve">Abre y muestra brevemente, en este orden: </w:t>
       </w:r>
       <w:r>
         <w:rPr>
           <w:rFonts w:ascii="Consolas" w:hAnsi="Consolas"/>
         </w:rPr>
-        <w:t>backend/src</w:t>
+        <w:t>backend/src/models/Ticket.js</w:t>
       </w:r>
       <w:r>
-        <w:t>):</w:t>
+        <w:t xml:space="preserve"> → </w:t>
+      </w:r>
+      <w:r>
+        <w:rPr>
+          <w:rFonts w:ascii="Consolas" w:hAnsi="Consolas"/>
+        </w:rPr>
+        <w:t>backend/src/controllers/ticketController.js</w:t>
+      </w:r>
+      <w:r>
+        <w:t xml:space="preserve"> → </w:t>
+      </w:r>
+      <w:r>
+        <w:rPr>
+          <w:rFonts w:ascii="Consolas" w:hAnsi="Consolas"/>
+        </w:rPr>
+        <w:t>backend/src/routes/tickets.js</w:t>
+      </w:r>
+      <w:r>
+        <w:t xml:space="preserve"> → </w:t>
+      </w:r>
+      <w:r>
+        <w:rPr>
+          <w:rFonts w:ascii="Consolas" w:hAnsi="Consolas"/>
+        </w:rPr>
+        <w:t>backend/src/server.js</w:t>
+      </w:r>
+      <w:r>
+        <w:t>.</w:t>
       </w:r>
     </w:p>
     <w:p>
       <w:pPr>
         <w:pStyle w:val="ListBullet"/>
-        <w:ind w:left="800"/>
       </w:pPr>
       <w:r>
-        <w:rPr>
-          <w:rFonts w:ascii="Consolas" w:hAnsi="Consolas"/>
-        </w:rPr>
-        <w:t>models/Ticket.js</w:t>
-      </w:r>
-      <w:r>
-        <w:t>: el esquema de Mongoose — explica los campos (</w:t>
+        <w:t xml:space="preserve">Luego cambia a: </w:t>
       </w:r>
       <w:r>
         <w:rPr>
           <w:rFonts w:ascii="Consolas" w:hAnsi="Consolas"/>
         </w:rPr>
-        <w:t>titulo</w:t>
+        <w:t>frontend/js/config.js</w:t>
       </w:r>
       <w:r>
-        <w:t xml:space="preserve">, </w:t>
+        <w:t xml:space="preserve"> → </w:t>
       </w:r>
       <w:r>
         <w:rPr>
           <w:rFonts w:ascii="Consolas" w:hAnsi="Consolas"/>
         </w:rPr>
-        <w:t>descripcion</w:t>
+        <w:t>frontend/js/api.js</w:t>
       </w:r>
       <w:r>
-        <w:t xml:space="preserve">, </w:t>
+        <w:t xml:space="preserve"> → </w:t>
       </w:r>
       <w:r>
         <w:rPr>
           <w:rFonts w:ascii="Consolas" w:hAnsi="Consolas"/>
         </w:rPr>
-        <w:t>solicitante</w:t>
+        <w:t>frontend/js/dashboard.js</w:t>
       </w:r>
       <w:r>
-        <w:t xml:space="preserve">, </w:t>
+        <w:t xml:space="preserve"> (o cualquiera de las vistas) → </w:t>
       </w:r>
       <w:r>
         <w:rPr>
           <w:rFonts w:ascii="Consolas" w:hAnsi="Consolas"/>
         </w:rPr>
-        <w:t>categoria</w:t>
+        <w:t>frontend/js/app.js</w:t>
       </w:r>
       <w:r>
-        <w:t xml:space="preserve">, </w:t>
-      </w:r>
-      <w:r>
-        <w:rPr>
-          <w:rFonts w:ascii="Consolas" w:hAnsi="Consolas"/>
-        </w:rPr>
-        <w:t>prioridad</w:t>
-      </w:r>
-      <w:r>
-        <w:t xml:space="preserve">, </w:t>
-      </w:r>
-      <w:r>
-        <w:rPr>
-          <w:rFonts w:ascii="Consolas" w:hAnsi="Consolas"/>
-        </w:rPr>
-        <w:t>estado</w:t>
-      </w:r>
-      <w:r>
-        <w:t>) y los enums.</w:t>
+        <w:t>.</w:t>
       </w:r>
     </w:p>
     <w:p>
       <w:pPr>
         <w:pStyle w:val="ListBullet"/>
-        <w:ind w:left="800"/>
       </w:pPr>
       <w:r>
-        <w:rPr>
-          <w:rFonts w:ascii="Consolas" w:hAnsi="Consolas"/>
-        </w:rPr>
-        <w:t>controllers/ticketController.js</w:t>
-      </w:r>
-      <w:r>
-        <w:t>: la lógica de cada endpoint (listar, obtener, crear, actualizar, eliminar).</w:t>
+        <w:t>No necesitas leer el código línea por línea, solo señala con el cursor las partes que menciones al hablar.</w:t>
       </w:r>
     </w:p>
     <w:p>
-      <w:pPr>
-        <w:pStyle w:val="ListBullet"/>
-        <w:ind w:left="800"/>
-      </w:pPr>
       <w:r>
         <w:rPr>
-          <w:rFonts w:ascii="Consolas" w:hAnsi="Consolas"/>
+          <w:b/>
         </w:rPr>
-        <w:t>routes/tickets.js</w:t>
-      </w:r>
-      <w:r>
-        <w:t>: cómo las rutas conectan HTTP con los controladores.</w:t>
-      </w:r>
-    </w:p>
-    <w:p>
-      <w:pPr>
-        <w:pStyle w:val="ListBullet"/>
-        <w:ind w:left="800"/>
-      </w:pPr>
-      <w:r>
-        <w:rPr>
-          <w:rFonts w:ascii="Consolas" w:hAnsi="Consolas"/>
-        </w:rPr>
-        <w:t>config/db.js</w:t>
-      </w:r>
-      <w:r>
-        <w:t xml:space="preserve"> y </w:t>
-      </w:r>
-      <w:r>
-        <w:rPr>
-          <w:rFonts w:ascii="Consolas" w:hAnsi="Consolas"/>
-        </w:rPr>
-        <w:t>server.js</w:t>
-      </w:r>
-      <w:r>
-        <w:t xml:space="preserve">: la conexión a MongoDB vía variable de entorno </w:t>
-      </w:r>
-      <w:r>
-        <w:rPr>
-          <w:rFonts w:ascii="Consolas" w:hAnsi="Consolas"/>
-        </w:rPr>
-        <w:t>MONGODB_URI</w:t>
-      </w:r>
-      <w:r>
-        <w:t xml:space="preserve"> y el arranque del servidor Express.</w:t>
+        <w:t>🗣️ QUÉ DECIR (mientras muestras el backend):</w:t>
       </w:r>
     </w:p>
     <w:p>
@@ -938,117 +894,15 @@
         <w:rPr>
           <w:i/>
         </w:rPr>
-        <w:t>"Aquí pueden ver que separé el código en modelos, controladores y rutas, siguiendo el patrón MVC para que sea mantenible."</w:t>
+        <w:t>"Aquí pueden ver que separé el código en modelos, controladores y rutas, siguiendo el patrón MVC para que sea mantenible. En el modelo defino los campos del ticket: título, descripción, solicitante, categoría, prioridad y estado. El controlador tiene la lógica de cada operación: listar, crear, actualizar y eliminar. Y las rutas conectan cada endpoint HTTP con su función correspondiente. El servidor se conecta a MongoDB usando una variable de entorno."</w:t>
       </w:r>
     </w:p>
     <w:p>
-      <w:pPr>
-        <w:pStyle w:val="ListNumber"/>
-      </w:pPr>
       <w:r>
         <w:rPr>
           <w:b/>
         </w:rPr>
-        <w:t>Frontend</w:t>
-      </w:r>
-      <w:r>
-        <w:t xml:space="preserve"> (</w:t>
-      </w:r>
-      <w:r>
-        <w:rPr>
-          <w:rFonts w:ascii="Consolas" w:hAnsi="Consolas"/>
-        </w:rPr>
-        <w:t>frontend/js</w:t>
-      </w:r>
-      <w:r>
-        <w:t>):</w:t>
-      </w:r>
-    </w:p>
-    <w:p>
-      <w:pPr>
-        <w:pStyle w:val="ListBullet"/>
-        <w:ind w:left="800"/>
-      </w:pPr>
-      <w:r>
-        <w:rPr>
-          <w:rFonts w:ascii="Consolas" w:hAnsi="Consolas"/>
-        </w:rPr>
-        <w:t>config.js</w:t>
-      </w:r>
-      <w:r>
-        <w:t>: la URL de la API centralizada en una constante.</w:t>
-      </w:r>
-    </w:p>
-    <w:p>
-      <w:pPr>
-        <w:pStyle w:val="ListBullet"/>
-        <w:ind w:left="800"/>
-      </w:pPr>
-      <w:r>
-        <w:rPr>
-          <w:rFonts w:ascii="Consolas" w:hAnsi="Consolas"/>
-        </w:rPr>
-        <w:t>api.js</w:t>
-      </w:r>
-      <w:r>
-        <w:t xml:space="preserve">: el módulo que encapsula todas las llamadas </w:t>
-      </w:r>
-      <w:r>
-        <w:rPr>
-          <w:rFonts w:ascii="Consolas" w:hAnsi="Consolas"/>
-        </w:rPr>
-        <w:t>fetch</w:t>
-      </w:r>
-      <w:r>
-        <w:t xml:space="preserve"> a la API.</w:t>
-      </w:r>
-    </w:p>
-    <w:p>
-      <w:pPr>
-        <w:pStyle w:val="ListBullet"/>
-        <w:ind w:left="800"/>
-      </w:pPr>
-      <w:r>
-        <w:rPr>
-          <w:rFonts w:ascii="Consolas" w:hAnsi="Consolas"/>
-        </w:rPr>
-        <w:t>dashboard.js</w:t>
-      </w:r>
-      <w:r>
-        <w:t xml:space="preserve">, </w:t>
-      </w:r>
-      <w:r>
-        <w:rPr>
-          <w:rFonts w:ascii="Consolas" w:hAnsi="Consolas"/>
-        </w:rPr>
-        <w:t>formulario.js</w:t>
-      </w:r>
-      <w:r>
-        <w:t xml:space="preserve">, </w:t>
-      </w:r>
-      <w:r>
-        <w:rPr>
-          <w:rFonts w:ascii="Consolas" w:hAnsi="Consolas"/>
-        </w:rPr>
-        <w:t>lista.js</w:t>
-      </w:r>
-      <w:r>
-        <w:t>: cada uno maneja su propia vista.</w:t>
-      </w:r>
-    </w:p>
-    <w:p>
-      <w:pPr>
-        <w:pStyle w:val="ListBullet"/>
-        <w:ind w:left="800"/>
-      </w:pPr>
-      <w:r>
-        <w:rPr>
-          <w:rFonts w:ascii="Consolas" w:hAnsi="Consolas"/>
-        </w:rPr>
-        <w:t>app.js</w:t>
-      </w:r>
-      <w:r>
-        <w:t>: el router simple que cambia entre vistas.</w:t>
+        <w:t>🗣️ QUÉ DECIR (mientras muestras el frontend):</w:t>
       </w:r>
     </w:p>
     <w:p>
@@ -1059,7 +913,7 @@
         <w:rPr>
           <w:i/>
         </w:rPr>
-        <w:t>"El frontend está modularizado por componente: Dashboard muestra estadísticas generales, Formulario permite crear tickets, y Lista permite verlos, cambiar su estado o eliminarlos, todo consumiendo la misma API REST."</w:t>
+        <w:t>"El frontend está modularizado por componente: Dashboard muestra estadísticas generales, Formulario permite crear tickets, y Lista permite verlos, cambiar su estado o eliminarlos, todo consumiendo la misma API REST a través de este módulo centralizado que encapsula las llamadas fetch."</w:t>
       </w:r>
     </w:p>
     <w:p>
@@ -1072,6 +926,17 @@
     </w:p>
     <w:p>
       <w:r>
+        <w:rPr>
+          <w:b/>
+        </w:rPr>
+        <w:t>🎬 QUÉ HACER:</w:t>
+      </w:r>
+    </w:p>
+    <w:p>
+      <w:pPr>
+        <w:pStyle w:val="ListNumber"/>
+      </w:pPr>
+      <w:r>
         <w:t xml:space="preserve">Cambia a la </w:t>
       </w:r>
       <w:r>
@@ -1081,7 +946,7 @@
         <w:t>pestaña 1</w:t>
       </w:r>
       <w:r>
-        <w:t xml:space="preserve"> que dejaste lista (</w:t>
+        <w:t xml:space="preserve"> del navegador (</w:t>
       </w:r>
       <w:r>
         <w:rPr>
@@ -1090,7 +955,7 @@
         <w:t>https://sistema-help-desk-green.vercel.app</w:t>
       </w:r>
       <w:r>
-        <w:t>). Sigue estos clics exactos:</w:t>
+        <w:t>). Debe abrir en Dashboard.</w:t>
       </w:r>
     </w:p>
     <w:p>
@@ -1098,24 +963,7 @@
         <w:pStyle w:val="ListNumber"/>
       </w:pPr>
       <w:r>
-        <w:t xml:space="preserve">La página abre en </w:t>
-      </w:r>
-      <w:r>
-        <w:rPr>
-          <w:b/>
-        </w:rPr>
-        <w:t>Dashboard</w:t>
-      </w:r>
-      <w:r>
-        <w:t>. Señala con el mouse las 4 tarjetas (Total, Abiertos, En progreso, Cerrados) y di: "aquí vemos el resumen en tiempo real, actualmente hay algunos tickets ya cargados de pruebas anteriores."</w:t>
-      </w:r>
-    </w:p>
-    <w:p>
-      <w:pPr>
-        <w:pStyle w:val="ListNumber"/>
-      </w:pPr>
-      <w:r>
-        <w:t xml:space="preserve">Clic en el botón </w:t>
+        <w:t xml:space="preserve">Clic en </w:t>
       </w:r>
       <w:r>
         <w:rPr>
@@ -1124,7 +972,7 @@
         <w:t>"Nuevo Ticket"</w:t>
       </w:r>
       <w:r>
-        <w:t xml:space="preserve"> (arriba, en el menú azul).</w:t>
+        <w:t xml:space="preserve"> (menú azul, arriba).</w:t>
       </w:r>
     </w:p>
     <w:p>
@@ -1132,7 +980,7 @@
         <w:pStyle w:val="ListNumber"/>
       </w:pPr>
       <w:r>
-        <w:t>Llena el formulario en vivo, hablando mientras escribes:</w:t>
+        <w:t>Llena el formulario mientras hablas:</w:t>
       </w:r>
     </w:p>
     <w:p>
@@ -1174,7 +1022,7 @@
         <w:ind w:left="800"/>
       </w:pPr>
       <w:r>
-        <w:t>Categoría: elige "Hardware"</w:t>
+        <w:t>Categoría: "Hardware"</w:t>
       </w:r>
     </w:p>
     <w:p>
@@ -1183,7 +1031,7 @@
         <w:ind w:left="800"/>
       </w:pPr>
       <w:r>
-        <w:t>Prioridad: elige "Alta"</w:t>
+        <w:t>Prioridad: "Alta"</w:t>
       </w:r>
     </w:p>
     <w:p>
@@ -1200,7 +1048,7 @@
         <w:t>"Crear ticket"</w:t>
       </w:r>
       <w:r>
-        <w:t>. El sistema te lleva automáticamente a la Lista.</w:t>
+        <w:t xml:space="preserve"> (te lleva automáticamente a la Lista).</w:t>
       </w:r>
     </w:p>
     <w:p>
@@ -1208,16 +1056,7 @@
         <w:pStyle w:val="ListNumber"/>
       </w:pPr>
       <w:r>
-        <w:t xml:space="preserve">En </w:t>
-      </w:r>
-      <w:r>
-        <w:rPr>
-          <w:b/>
-        </w:rPr>
-        <w:t>"Lista de Tickets"</w:t>
-      </w:r>
-      <w:r>
-        <w:t>, señala la fila que acabas de crear. Di: "este ticket ya está guardado en MongoDB Atlas, en la nube."</w:t>
+        <w:t>Señala con el mouse la fila del ticket recién creado.</w:t>
       </w:r>
     </w:p>
     <w:p>
@@ -1225,7 +1064,7 @@
         <w:pStyle w:val="ListNumber"/>
       </w:pPr>
       <w:r>
-        <w:t xml:space="preserve">En esa misma fila, clic en el desplegable de </w:t>
+        <w:t xml:space="preserve">Clic en el desplegable de </w:t>
       </w:r>
       <w:r>
         <w:rPr>
@@ -1234,7 +1073,7 @@
         <w:t>Estado</w:t>
       </w:r>
       <w:r>
-        <w:t xml:space="preserve"> y cámbialo de "Abierto" a </w:t>
+        <w:t xml:space="preserve"> de esa fila → cámbialo a </w:t>
       </w:r>
       <w:r>
         <w:rPr>
@@ -1243,7 +1082,7 @@
         <w:t>"En Progreso"</w:t>
       </w:r>
       <w:r>
-        <w:t>. Espera el mensaje de confirmación (toast) que aparece abajo a la derecha.</w:t>
+        <w:t>. Espera el mensaje de confirmación abajo a la derecha.</w:t>
       </w:r>
     </w:p>
     <w:p>
@@ -1251,7 +1090,7 @@
         <w:pStyle w:val="ListNumber"/>
       </w:pPr>
       <w:r>
-        <w:t xml:space="preserve">Clic en el botón </w:t>
+        <w:t xml:space="preserve">Clic en </w:t>
       </w:r>
       <w:r>
         <w:rPr>
@@ -1260,7 +1099,7 @@
         <w:t>"Dashboard"</w:t>
       </w:r>
       <w:r>
-        <w:t xml:space="preserve"> (arriba) para volver. Señala que las tarjetas de "Abiertos" y "En progreso" cambiaron su número.</w:t>
+        <w:t xml:space="preserve"> (arriba) para volver. Señala que las tarjetas cambiaron de número.</w:t>
       </w:r>
     </w:p>
     <w:p>
@@ -1268,7 +1107,7 @@
         <w:pStyle w:val="ListNumber"/>
       </w:pPr>
       <w:r>
-        <w:t xml:space="preserve">(Opcional, si te sobra tiempo) Vuelve a Lista y haz clic en </w:t>
+        <w:t xml:space="preserve">*(Opcional, si te sobra tiempo)* Vuelve a Lista, clic en </w:t>
       </w:r>
       <w:r>
         <w:rPr>
@@ -1277,7 +1116,15 @@
         <w:t>"Eliminar"</w:t>
       </w:r>
       <w:r>
-        <w:t xml:space="preserve"> en el ticket de prueba, confirma en el diálogo, para mostrar también el borrado.</w:t>
+        <w:t xml:space="preserve"> en el ticket de prueba, confirma en el diálogo.</w:t>
+      </w:r>
+    </w:p>
+    <w:p>
+      <w:r>
+        <w:rPr>
+          <w:b/>
+        </w:rPr>
+        <w:t>🗣️ QUÉ DECIR (al llegar al Dashboard, paso 1):</w:t>
       </w:r>
     </w:p>
     <w:p>
@@ -1288,7 +1135,64 @@
         <w:rPr>
           <w:i/>
         </w:rPr>
-        <w:t>"Como pueden ver, toda esta información se está guardando en tiempo real en MongoDB Atlas, en la nube, y el servidor que la procesa está corriendo en Render — no hay nada corriendo en mi computadora."</w:t>
+        <w:t>"Aquí vemos el resumen en tiempo real; actualmente hay algunos tickets ya cargados de pruebas anteriores."</w:t>
+      </w:r>
+    </w:p>
+    <w:p>
+      <w:r>
+        <w:rPr>
+          <w:b/>
+        </w:rPr>
+        <w:t>🗣️ QUÉ DECIR (al crear el ticket, pasos 2-4):</w:t>
+      </w:r>
+    </w:p>
+    <w:p>
+      <w:pPr>
+        <w:ind w:left="400"/>
+      </w:pPr>
+      <w:r>
+        <w:rPr>
+          <w:i/>
+        </w:rPr>
+        <w:t>Puedes narrar en voz alta lo que vas escribiendo, por ejemplo: "Voy a crear un nuevo ticket: título 'impresora sin conexión', categoría hardware, prioridad alta, y lo envío."</w:t>
+      </w:r>
+    </w:p>
+    <w:p>
+      <w:r>
+        <w:rPr>
+          <w:b/>
+        </w:rPr>
+        <w:t>🗣️ QUÉ DECIR (al verlo en la lista, paso 5):</w:t>
+      </w:r>
+    </w:p>
+    <w:p>
+      <w:pPr>
+        <w:ind w:left="400"/>
+      </w:pPr>
+      <w:r>
+        <w:rPr>
+          <w:i/>
+        </w:rPr>
+        <w:t>"Este ticket ya está guardado en MongoDB Atlas, en la nube."</w:t>
+      </w:r>
+    </w:p>
+    <w:p>
+      <w:r>
+        <w:rPr>
+          <w:b/>
+        </w:rPr>
+        <w:t>🗣️ QUÉ DECIR (al cambiar el estado y volver al Dashboard, pasos 6-7):</w:t>
+      </w:r>
+    </w:p>
+    <w:p>
+      <w:pPr>
+        <w:ind w:left="400"/>
+      </w:pPr>
+      <w:r>
+        <w:rPr>
+          <w:i/>
+        </w:rPr>
+        <w:t>"Como pueden ver, toda esta información se está guardando en tiempo real en MongoDB Atlas, y el servidor que la procesa está corriendo en Render — no hay nada corriendo en mi computadora."</w:t>
       </w:r>
     </w:p>
     <w:p>
@@ -1300,84 +1204,11 @@
       </w:r>
     </w:p>
     <w:p>
-      <w:pPr>
-        <w:ind w:left="400"/>
-      </w:pPr>
       <w:r>
         <w:rPr>
-          <w:i/>
+          <w:b/>
         </w:rPr>
-        <w:t xml:space="preserve">"El código está organizado en un único repositorio de GitHub con dos carpetas, </w:t>
-      </w:r>
-      <w:r>
-        <w:rPr>
-          <w:rFonts w:ascii="Consolas" w:hAnsi="Consolas"/>
-          <w:i/>
-        </w:rPr>
-        <w:t>backend</w:t>
-      </w:r>
-      <w:r>
-        <w:rPr>
-          <w:i/>
-        </w:rPr>
-        <w:t xml:space="preserve"> y </w:t>
-      </w:r>
-      <w:r>
-        <w:rPr>
-          <w:rFonts w:ascii="Consolas" w:hAnsi="Consolas"/>
-          <w:i/>
-        </w:rPr>
-        <w:t>frontend</w:t>
-      </w:r>
-      <w:r>
-        <w:rPr>
-          <w:i/>
-        </w:rPr>
-        <w:t xml:space="preserve">, siguiendo un flujo de ramas con </w:t>
-      </w:r>
-      <w:r>
-        <w:rPr>
-          <w:rFonts w:ascii="Consolas" w:hAnsi="Consolas"/>
-          <w:i/>
-        </w:rPr>
-        <w:t>feature branches</w:t>
-      </w:r>
-      <w:r>
-        <w:rPr>
-          <w:i/>
-        </w:rPr>
-        <w:t xml:space="preserve">, </w:t>
-      </w:r>
-      <w:r>
-        <w:rPr>
-          <w:rFonts w:ascii="Consolas" w:hAnsi="Consolas"/>
-          <w:i/>
-        </w:rPr>
-        <w:t>develop</w:t>
-      </w:r>
-      <w:r>
-        <w:rPr>
-          <w:i/>
-        </w:rPr>
-        <w:t xml:space="preserve"> y </w:t>
-      </w:r>
-      <w:r>
-        <w:rPr>
-          <w:rFonts w:ascii="Consolas" w:hAnsi="Consolas"/>
-          <w:i/>
-        </w:rPr>
-        <w:t>main</w:t>
-      </w:r>
-      <w:r>
-        <w:rPr>
-          <w:i/>
-        </w:rPr>
-        <w:t>. El backend está desplegado en Render, conectado a un cluster gratuito de MongoDB Atlas, y el frontend está desplegado como sitio estático en Vercel."</w:t>
-      </w:r>
-    </w:p>
-    <w:p>
-      <w:r>
-        <w:t>Ve cambiando de pestaña mientras hablas:</w:t>
+        <w:t>🎬 QUÉ HACER:</w:t>
       </w:r>
     </w:p>
     <w:p>
@@ -1385,31 +1216,16 @@
         <w:pStyle w:val="ListNumber"/>
       </w:pPr>
       <w:r>
+        <w:t xml:space="preserve">Cambia a la </w:t>
+      </w:r>
+      <w:r>
         <w:rPr>
           <w:b/>
         </w:rPr>
-        <w:t>Pestaña 2</w:t>
+        <w:t>pestaña 2</w:t>
       </w:r>
       <w:r>
-        <w:t xml:space="preserve"> (GitHub): muestra la lista de archivos, y si quieres, clic en "commits" para mostrar el historial con los mensajes </w:t>
-      </w:r>
-      <w:r>
-        <w:rPr>
-          <w:rFonts w:ascii="Consolas" w:hAnsi="Consolas"/>
-        </w:rPr>
-        <w:t>feat(backend)...</w:t>
-      </w:r>
-      <w:r>
-        <w:t xml:space="preserve">, </w:t>
-      </w:r>
-      <w:r>
-        <w:rPr>
-          <w:rFonts w:ascii="Consolas" w:hAnsi="Consolas"/>
-        </w:rPr>
-        <w:t>feat(frontend)...</w:t>
-      </w:r>
-      <w:r>
-        <w:t>.</w:t>
+        <w:t xml:space="preserve"> (GitHub): muestra la lista de archivos y, si quieres, entra a "commits" para mostrar el historial.</w:t>
       </w:r>
     </w:p>
     <w:p>
@@ -1417,10 +1233,13 @@
         <w:pStyle w:val="ListNumber"/>
       </w:pPr>
       <w:r>
+        <w:t xml:space="preserve">Cambia a la </w:t>
+      </w:r>
+      <w:r>
         <w:rPr>
           <w:b/>
         </w:rPr>
-        <w:t>Pestaña 3</w:t>
+        <w:t>pestaña 3</w:t>
       </w:r>
       <w:r>
         <w:t xml:space="preserve"> (Render): muestra que el servicio </w:t>
@@ -1449,22 +1268,16 @@
         <w:pStyle w:val="ListNumber"/>
       </w:pPr>
       <w:r>
+        <w:t xml:space="preserve">Cambia a la </w:t>
+      </w:r>
+      <w:r>
         <w:rPr>
           <w:b/>
         </w:rPr>
-        <w:t>Pestaña 4</w:t>
+        <w:t>pestaña 4</w:t>
       </w:r>
       <w:r>
-        <w:t xml:space="preserve"> (Vercel): muestra que el proyecto </w:t>
-      </w:r>
-      <w:r>
-        <w:rPr>
-          <w:rFonts w:ascii="Consolas" w:hAnsi="Consolas"/>
-        </w:rPr>
-        <w:t>sistema-help-desk</w:t>
-      </w:r>
-      <w:r>
-        <w:t xml:space="preserve"> tiene un deployment marcado como </w:t>
+        <w:t xml:space="preserve"> (Vercel): muestra que el proyecto tiene un deployment marcado como </w:t>
       </w:r>
       <w:r>
         <w:rPr>
@@ -1473,7 +1286,26 @@
         <w:t>"Ready"</w:t>
       </w:r>
       <w:r>
-        <w:t xml:space="preserve"> / con el check verde.</w:t>
+        <w:t>.</w:t>
+      </w:r>
+    </w:p>
+    <w:p>
+      <w:r>
+        <w:rPr>
+          <w:b/>
+        </w:rPr>
+        <w:t>🗣️ QUÉ DECIR (puedes hablar mientras cambias entre las 3 pestañas):</w:t>
+      </w:r>
+    </w:p>
+    <w:p>
+      <w:pPr>
+        <w:ind w:left="400"/>
+      </w:pPr>
+      <w:r>
+        <w:rPr>
+          <w:i/>
+        </w:rPr>
+        <w:t>"El código está organizado en un único repositorio de GitHub con dos carpetas, backend y frontend, siguiendo un flujo de ramas con feature branches, develop y main. El backend está desplegado en Render, conectado a un cluster gratuito de MongoDB Atlas, y el frontend está desplegado como sitio estático en Vercel."</w:t>
       </w:r>
     </w:p>
     <w:p>
@@ -1482,6 +1314,30 @@
       </w:pPr>
       <w:r>
         <w:t>6. Cierre (20-30 seg)</w:t>
+      </w:r>
+    </w:p>
+    <w:p>
+      <w:r>
+        <w:rPr>
+          <w:b/>
+        </w:rPr>
+        <w:t>🎬 QUÉ HACER:</w:t>
+      </w:r>
+    </w:p>
+    <w:p>
+      <w:pPr>
+        <w:pStyle w:val="ListBullet"/>
+      </w:pPr>
+      <w:r>
+        <w:t>Vuelve a mostrar tu rostro en pantalla completa (cierra o minimiza las ventanas de código/navegador).</w:t>
+      </w:r>
+    </w:p>
+    <w:p>
+      <w:r>
+        <w:rPr>
+          <w:b/>
+        </w:rPr>
+        <w:t>🗣️ QUÉ DECIR:</w:t>
       </w:r>
     </w:p>
     <w:p>

</xml_diff>

<commit_message>
docs: enriquecer guion del video con mas profundidad tecnica y justificacion
</commit_message>
<xml_diff>
--- a/docs/guion_video_actividad9.docx
+++ b/docs/guion_video_actividad9.docx
@@ -12,7 +12,7 @@
     </w:p>
     <w:p>
       <w:r>
-        <w:t>Duración objetivo: 6-8 minutos. Habla con naturalidad, no leas palabra por palabra: usa esto como guía de puntos.</w:t>
+        <w:t>Duración objetivo: 8-10 minutos (dentro del rango 5-10 min que pide la guía). Habla con naturalidad, no leas palabra por palabra: usa esto como guía de puntos, con más profundidad técnica y justificación de decisiones para que se note dominio del tema, no solo memorización.</w:t>
       </w:r>
     </w:p>
     <w:p>
@@ -668,7 +668,7 @@
         <w:pStyle w:val="Heading2"/>
       </w:pPr>
       <w:r>
-        <w:t>1. Introducción (30-40 seg)</w:t>
+        <w:t>1. Introducción (40-50 seg)</w:t>
       </w:r>
     </w:p>
     <w:p>
@@ -703,15 +703,47 @@
         <w:rPr>
           <w:i/>
         </w:rPr>
-        <w:t>"Hola, mi nombre es Max Varela, estudiante de Tecnologías de la Información en Línea, quinto semestre. Este es el video de sustentación de la Actividad #9: el proyecto final de Desarrollo de Sistemas Informáticos — un sistema de gestión de incidentes tipo Help Desk, con frontend, backend y base de datos desplegados en la nube."</w:t>
+        <w:t>"Hola, mi nombre es Max Varela, estudiante de Tecnologías de la Información en Línea, quinto semestre, paralelo A. Este es el video de sustentación de la Actividad número 9: el proyecto final de la asignatura Desarrollo de Sistemas Informáticos.</w:t>
       </w:r>
     </w:p>
     <w:p>
+      <w:r>
+        <w:t>&gt;</w:t>
+      </w:r>
+    </w:p>
+    <w:p>
+      <w:pPr>
+        <w:ind w:left="400"/>
+      </w:pPr>
+      <w:r>
+        <w:rPr>
+          <w:i/>
+        </w:rPr>
+        <w:t>A lo largo del semestre construimos por partes un sistema de gestión de incidentes tipo Help Desk: primero el diseño y maquetado visual, luego la base de datos y la API REST en la Actividad 8, y ahora, en esta entrega final, el frontend que consume esa API, todo desplegado en servicios en la nube y funcionando en producción, sin depender de mi computadora local.</w:t>
+      </w:r>
+    </w:p>
+    <w:p>
+      <w:r>
+        <w:t>&gt;</w:t>
+      </w:r>
+    </w:p>
+    <w:p>
+      <w:pPr>
+        <w:ind w:left="400"/>
+      </w:pPr>
+      <w:r>
+        <w:rPr>
+          <w:i/>
+        </w:rPr>
+        <w:t>En los próximos minutos les voy a mostrar la arquitectura del sistema, voy a recorrer el código tanto del backend como del frontend, voy a hacer una demostración en vivo del sistema funcionando en internet, y voy a mostrarles dónde está desplegada cada parte."</w:t>
+      </w:r>
+    </w:p>
+    <w:p>
       <w:pPr>
         <w:pStyle w:val="Heading2"/>
       </w:pPr>
       <w:r>
-        <w:t>2. Arquitectura general (1 min)</w:t>
+        <w:t>2. Arquitectura general (1-1.5 min)</w:t>
       </w:r>
     </w:p>
     <w:p>
@@ -746,15 +778,79 @@
         <w:rPr>
           <w:i/>
         </w:rPr>
-        <w:t>"El sistema tiene tres capas desplegadas de forma independiente en la nube: el frontend, una SPA hecha en HTML, CSS y JavaScript puro, organizada en tres componentes — Dashboard, Formulario y Lista de tickets; el backend, una API REST construida con Node.js y Express, que expone operaciones CRUD para los tickets; y la base de datos, en MongoDB Atlas, en la nube, sin depender de ningún servidor local. El frontend consume la API mediante peticiones HTTP asíncronas con fetch, y la API se comunica con MongoDB Atlas mediante Mongoose."</w:t>
+        <w:t>"El sistema tiene tres capas, cada una desplegada de forma independiente en la nube, comunicándose entre sí por internet.</w:t>
       </w:r>
     </w:p>
     <w:p>
+      <w:r>
+        <w:t>&gt;</w:t>
+      </w:r>
+    </w:p>
+    <w:p>
+      <w:pPr>
+        <w:ind w:left="400"/>
+      </w:pPr>
+      <w:r>
+        <w:rPr>
+          <w:i/>
+        </w:rPr>
+        <w:t>Primero, el frontend: es una SPA, una Single Page Application, construida con HTML, CSS y JavaScript puro, sin frameworks pesados como Angular o React. La organicé en tres componentes bien separados: Dashboard, que muestra estadísticas; Formulario, para crear tickets nuevos; y Lista, para ver, actualizar y eliminar los existentes. Cada componente tiene su propio archivo JavaScript, lo que facilita mantener el código ordenado.</w:t>
+      </w:r>
+    </w:p>
+    <w:p>
+      <w:r>
+        <w:t>&gt;</w:t>
+      </w:r>
+    </w:p>
+    <w:p>
+      <w:pPr>
+        <w:ind w:left="400"/>
+      </w:pPr>
+      <w:r>
+        <w:rPr>
+          <w:i/>
+        </w:rPr>
+        <w:t>Segundo, el backend: es una API REST construida con Node.js y el framework Express, que expone operaciones CRUD — crear, leer, actualizar y eliminar — sobre el recurso 'ticket'. Sigue el patrón arquitectónico MVC, separando modelos, controladores y rutas.</w:t>
+      </w:r>
+    </w:p>
+    <w:p>
+      <w:r>
+        <w:t>&gt;</w:t>
+      </w:r>
+    </w:p>
+    <w:p>
+      <w:pPr>
+        <w:ind w:left="400"/>
+      </w:pPr>
+      <w:r>
+        <w:rPr>
+          <w:i/>
+        </w:rPr>
+        <w:t>Y tercero, la base de datos: MongoDB, alojada en MongoDB Atlas, un servicio cloud administrado, así que no depende de ningún servidor local ni de mi máquina.</w:t>
+      </w:r>
+    </w:p>
+    <w:p>
+      <w:r>
+        <w:t>&gt;</w:t>
+      </w:r>
+    </w:p>
+    <w:p>
+      <w:pPr>
+        <w:ind w:left="400"/>
+      </w:pPr>
+      <w:r>
+        <w:rPr>
+          <w:i/>
+        </w:rPr>
+        <w:t>La comunicación entre capas es así: el frontend le hace peticiones HTTP asíncronas a la API usando la función fetch de JavaScript; la API recibe esas peticiones con Express, las procesa, y usa Mongoose — que es un ODM, un mapeador de objetos a documentos — para leer y escribir en MongoDB Atlas. Todo esto viaja por internet en formato JSON."</w:t>
+      </w:r>
+    </w:p>
+    <w:p>
       <w:pPr>
         <w:pStyle w:val="Heading2"/>
       </w:pPr>
       <w:r>
-        <w:t>3. Recorrido del código (2-3 min)</w:t>
+        <w:t>2.1. Justificación de decisiones técnicas (1 min) — sección extra recomendada</w:t>
       </w:r>
     </w:p>
     <w:p>
@@ -770,6 +866,113 @@
         <w:pStyle w:val="ListBullet"/>
       </w:pPr>
       <w:r>
+        <w:t>Puedes seguir hablando a cámara, sin necesidad de compartir pantalla todavía.</w:t>
+      </w:r>
+    </w:p>
+    <w:p>
+      <w:r>
+        <w:rPr>
+          <w:b/>
+        </w:rPr>
+        <w:t>🗣️ QUÉ DECIR:</w:t>
+      </w:r>
+    </w:p>
+    <w:p>
+      <w:pPr>
+        <w:ind w:left="400"/>
+      </w:pPr>
+      <w:r>
+        <w:rPr>
+          <w:i/>
+        </w:rPr>
+        <w:t>"Quiero explicar brevemente por qué tomé estas decisiones técnicas.</w:t>
+      </w:r>
+    </w:p>
+    <w:p>
+      <w:r>
+        <w:t>&gt;</w:t>
+      </w:r>
+    </w:p>
+    <w:p>
+      <w:pPr>
+        <w:ind w:left="400"/>
+      </w:pPr>
+      <w:r>
+        <w:rPr>
+          <w:i/>
+        </w:rPr>
+        <w:t>Elegí Express sobre Node.js puro porque simplifica muchísimo el manejo de rutas, middlewares y respuestas HTTP, y es el estándar de facto en la industria para APIs REST en JavaScript.</w:t>
+      </w:r>
+    </w:p>
+    <w:p>
+      <w:r>
+        <w:t>&gt;</w:t>
+      </w:r>
+    </w:p>
+    <w:p>
+      <w:pPr>
+        <w:ind w:left="400"/>
+      </w:pPr>
+      <w:r>
+        <w:rPr>
+          <w:i/>
+        </w:rPr>
+        <w:t>Elegí MongoDB, una base de datos NoSQL orientada a documentos, porque el modelo de un ticket de soporte es relativamente flexible y no requiere relaciones complejas entre tablas — encaja natural en un documento JSON.</w:t>
+      </w:r>
+    </w:p>
+    <w:p>
+      <w:r>
+        <w:t>&gt;</w:t>
+      </w:r>
+    </w:p>
+    <w:p>
+      <w:pPr>
+        <w:ind w:left="400"/>
+      </w:pPr>
+      <w:r>
+        <w:rPr>
+          <w:i/>
+        </w:rPr>
+        <w:t>Para el frontend, en lugar de usar un framework como Angular, decidí construir la SPA con JavaScript puro para tener control total sobre cada parte del código y demostrar que entiendo los fundamentos — el manejo del DOM, las peticiones fetch, el manejo de estado — sin depender de abstracciones de un framework.</w:t>
+      </w:r>
+    </w:p>
+    <w:p>
+      <w:r>
+        <w:t>&gt;</w:t>
+      </w:r>
+    </w:p>
+    <w:p>
+      <w:pPr>
+        <w:ind w:left="400"/>
+      </w:pPr>
+      <w:r>
+        <w:rPr>
+          <w:i/>
+        </w:rPr>
+        <w:t>Y para el despliegue, elegí específicamente MongoDB Atlas, Render y Vercel porque los tres ofrecen niveles gratuitos suficientes para un proyecto académico, se integran directamente con GitHub, y son plataformas ampliamente usadas en la industria actualmente."</w:t>
+      </w:r>
+    </w:p>
+    <w:p>
+      <w:pPr>
+        <w:pStyle w:val="Heading2"/>
+      </w:pPr>
+      <w:r>
+        <w:t>3. Recorrido del código (3-4 min)</w:t>
+      </w:r>
+    </w:p>
+    <w:p>
+      <w:r>
+        <w:rPr>
+          <w:b/>
+        </w:rPr>
+        <w:t>🎬 QUÉ HACER:</w:t>
+      </w:r>
+    </w:p>
+    <w:p>
+      <w:pPr>
+        <w:pStyle w:val="ListBullet"/>
+      </w:pPr>
+      <w:r>
         <w:t xml:space="preserve">Cambia a la ventana de </w:t>
       </w:r>
       <w:r>
@@ -820,6 +1023,15 @@
         <w:rPr>
           <w:rFonts w:ascii="Consolas" w:hAnsi="Consolas"/>
         </w:rPr>
+        <w:t>backend/src/config/db.js</w:t>
+      </w:r>
+      <w:r>
+        <w:t xml:space="preserve"> → </w:t>
+      </w:r>
+      <w:r>
+        <w:rPr>
+          <w:rFonts w:ascii="Consolas" w:hAnsi="Consolas"/>
+        </w:rPr>
         <w:t>backend/src/server.js</w:t>
       </w:r>
       <w:r>
@@ -858,7 +1070,25 @@
         <w:t>frontend/js/dashboard.js</w:t>
       </w:r>
       <w:r>
-        <w:t xml:space="preserve"> (o cualquiera de las vistas) → </w:t>
+        <w:t xml:space="preserve"> → </w:t>
+      </w:r>
+      <w:r>
+        <w:rPr>
+          <w:rFonts w:ascii="Consolas" w:hAnsi="Consolas"/>
+        </w:rPr>
+        <w:t>frontend/js/formulario.js</w:t>
+      </w:r>
+      <w:r>
+        <w:t xml:space="preserve"> → </w:t>
+      </w:r>
+      <w:r>
+        <w:rPr>
+          <w:rFonts w:ascii="Consolas" w:hAnsi="Consolas"/>
+        </w:rPr>
+        <w:t>frontend/js/lista.js</w:t>
+      </w:r>
+      <w:r>
+        <w:t xml:space="preserve"> → </w:t>
       </w:r>
       <w:r>
         <w:rPr>
@@ -875,7 +1105,7 @@
         <w:pStyle w:val="ListBullet"/>
       </w:pPr>
       <w:r>
-        <w:t>No necesitas leer el código línea por línea, solo señala con el cursor las partes que menciones al hablar.</w:t>
+        <w:t>No necesitas leer el código línea por línea, solo señala con el cursor las partes que menciones al hablar. Ve despacio, dale 3-4 segundos a cada archivo para que se alcance a leer en el video.</w:t>
       </w:r>
     </w:p>
     <w:p>
@@ -883,7 +1113,7 @@
         <w:rPr>
           <w:b/>
         </w:rPr>
-        <w:t>🗣️ QUÉ DECIR (mientras muestras el backend):</w:t>
+        <w:t>🗣️ QUÉ DECIR (al abrir `Ticket.js`, el modelo):</w:t>
       </w:r>
     </w:p>
     <w:p>
@@ -894,7 +1124,116 @@
         <w:rPr>
           <w:i/>
         </w:rPr>
-        <w:t>"Aquí pueden ver que separé el código en modelos, controladores y rutas, siguiendo el patrón MVC para que sea mantenible. En el modelo defino los campos del ticket: título, descripción, solicitante, categoría, prioridad y estado. El controlador tiene la lógica de cada operación: listar, crear, actualizar y eliminar. Y las rutas conectan cada endpoint HTTP con su función correspondiente. El servidor se conecta a MongoDB usando una variable de entorno."</w:t>
+        <w:t xml:space="preserve">"Empiezo por el modelo, en </w:t>
+      </w:r>
+      <w:r>
+        <w:rPr>
+          <w:rFonts w:ascii="Consolas" w:hAnsi="Consolas"/>
+          <w:i/>
+        </w:rPr>
+        <w:t>models/Ticket.js</w:t>
+      </w:r>
+      <w:r>
+        <w:rPr>
+          <w:i/>
+        </w:rPr>
+        <w:t>. Aquí defino con Mongoose el esquema del ticket: título, descripción y solicitante son campos de texto obligatorios; categoría es un campo restringido a tres valores posibles — Red, Hardware o Software — usando un enum, lo que evita datos inconsistentes; prioridad y estado también usan enums, con valores por defecto 'Media' y 'Abierto' respectivamente. Además, activé la opción timestamps, que agrega automáticamente la fecha de creación y actualización a cada documento."</w:t>
+      </w:r>
+    </w:p>
+    <w:p>
+      <w:r>
+        <w:rPr>
+          <w:b/>
+        </w:rPr>
+        <w:t>🗣️ QUÉ DECIR (al abrir `ticketController.js`):</w:t>
+      </w:r>
+    </w:p>
+    <w:p>
+      <w:pPr>
+        <w:ind w:left="400"/>
+      </w:pPr>
+      <w:r>
+        <w:rPr>
+          <w:i/>
+        </w:rPr>
+        <w:t>"En el controlador está la lógica de negocio de cada operación. La función listarTickets hace una consulta find y ordena por fecha de creación descendente, para ver los más recientes primero. crearTicket recibe los datos del cuerpo de la petición y los guarda con create. actualizarTicket usa findByIdAndUpdate con la opción runValidators activada, para que se respeten los enums del esquema incluso al actualizar. Y eliminarTicket usa findByIdAndDelete. Cada función maneja sus errores con try-catch y devuelve el código de estado HTTP apropiado — 404 si no se encuentra el ticket, 400 si los datos son inválidos, 500 si hay un error del servidor."</w:t>
+      </w:r>
+    </w:p>
+    <w:p>
+      <w:r>
+        <w:rPr>
+          <w:b/>
+        </w:rPr>
+        <w:t>🗣️ QUÉ DECIR (al abrir `tickets.js`, las rutas):</w:t>
+      </w:r>
+    </w:p>
+    <w:p>
+      <w:pPr>
+        <w:ind w:left="400"/>
+      </w:pPr>
+      <w:r>
+        <w:rPr>
+          <w:i/>
+        </w:rPr>
+        <w:t xml:space="preserve">"Las rutas son el punto de entrada HTTP: mapean cada verbo y cada URL — GET, POST, PUT, DELETE sobre </w:t>
+      </w:r>
+      <w:r>
+        <w:rPr>
+          <w:rFonts w:ascii="Consolas" w:hAnsi="Consolas"/>
+          <w:i/>
+        </w:rPr>
+        <w:t>/api/tickets</w:t>
+      </w:r>
+      <w:r>
+        <w:rPr>
+          <w:i/>
+        </w:rPr>
+        <w:t xml:space="preserve"> — a su función correspondiente en el controlador. Esto separa claramente 'qué endpoint existe' de 'cómo se procesa cada uno', que es justo la idea del patrón MVC."</w:t>
+      </w:r>
+    </w:p>
+    <w:p>
+      <w:r>
+        <w:rPr>
+          <w:b/>
+        </w:rPr>
+        <w:t>🗣️ QUÉ DECIR (al abrir `server.js`):</w:t>
+      </w:r>
+    </w:p>
+    <w:p>
+      <w:pPr>
+        <w:ind w:left="400"/>
+      </w:pPr>
+      <w:r>
+        <w:rPr>
+          <w:i/>
+        </w:rPr>
+        <w:t xml:space="preserve">"Y en </w:t>
+      </w:r>
+      <w:r>
+        <w:rPr>
+          <w:rFonts w:ascii="Consolas" w:hAnsi="Consolas"/>
+          <w:i/>
+        </w:rPr>
+        <w:t>server.js</w:t>
+      </w:r>
+      <w:r>
+        <w:rPr>
+          <w:i/>
+        </w:rPr>
+        <w:t xml:space="preserve"> arranco la aplicación: configuro Express, habilito CORS para que el frontend, que vive en otro dominio, pueda hacer peticiones sin ser bloqueado por el navegador, habilito el parseo de JSON en el cuerpo de las peticiones, monto las rutas de tickets bajo </w:t>
+      </w:r>
+      <w:r>
+        <w:rPr>
+          <w:rFonts w:ascii="Consolas" w:hAnsi="Consolas"/>
+          <w:i/>
+        </w:rPr>
+        <w:t>/api/tickets</w:t>
+      </w:r>
+      <w:r>
+        <w:rPr>
+          <w:i/>
+        </w:rPr>
+        <w:t>, y antes de levantar el servidor me conecto a MongoDB usando la variable de entorno MONGODB_URI — así nunca dejo credenciales escritas directamente en el código."</w:t>
       </w:r>
     </w:p>
     <w:p>
@@ -913,7 +1252,46 @@
         <w:rPr>
           <w:i/>
         </w:rPr>
-        <w:t>"El frontend está modularizado por componente: Dashboard muestra estadísticas generales, Formulario permite crear tickets, y Lista permite verlos, cambiar su estado o eliminarlos, todo consumiendo la misma API REST a través de este módulo centralizado que encapsula las llamadas fetch."</w:t>
+        <w:t xml:space="preserve">"Del lado del frontend, </w:t>
+      </w:r>
+      <w:r>
+        <w:rPr>
+          <w:rFonts w:ascii="Consolas" w:hAnsi="Consolas"/>
+          <w:i/>
+        </w:rPr>
+        <w:t>config.js</w:t>
+      </w:r>
+      <w:r>
+        <w:rPr>
+          <w:i/>
+        </w:rPr>
+        <w:t xml:space="preserve"> centraliza la URL base de la API en una sola constante, así que si algún día cambio de proveedor de hosting, solo edito un archivo. </w:t>
+      </w:r>
+      <w:r>
+        <w:rPr>
+          <w:rFonts w:ascii="Consolas" w:hAnsi="Consolas"/>
+          <w:i/>
+        </w:rPr>
+        <w:t>api.js</w:t>
+      </w:r>
+      <w:r>
+        <w:rPr>
+          <w:i/>
+        </w:rPr>
+        <w:t xml:space="preserve"> encapsula todas las llamadas fetch — listar, crear, actualizar, eliminar — en un solo objeto TicketAPI, para no repetir código en cada vista. Cada vista, Dashboard, Formulario y Lista, tiene su propio archivo con un método render que construye su HTML dinámicamente según los datos que recibe de la API. Y </w:t>
+      </w:r>
+      <w:r>
+        <w:rPr>
+          <w:rFonts w:ascii="Consolas" w:hAnsi="Consolas"/>
+          <w:i/>
+        </w:rPr>
+        <w:t>app.js</w:t>
+      </w:r>
+      <w:r>
+        <w:rPr>
+          <w:i/>
+        </w:rPr>
+        <w:t xml:space="preserve"> hace de router simple: escucha los clics en el menú de navegación y muestra u oculta cada sección."</w:t>
       </w:r>
     </w:p>
     <w:p>
@@ -1135,7 +1513,7 @@
         <w:rPr>
           <w:i/>
         </w:rPr>
-        <w:t>"Aquí vemos el resumen en tiempo real; actualmente hay algunos tickets ya cargados de pruebas anteriores."</w:t>
+        <w:t>"Estamos viendo el sistema en su URL pública real, no en localhost. Aquí está el Dashboard, con el resumen en tiempo real: total de tickets, abiertos, en progreso y cerrados. Estos números salen de una consulta a la API que corre en el momento en que carga la página."</w:t>
       </w:r>
     </w:p>
     <w:p>
@@ -1154,7 +1532,7 @@
         <w:rPr>
           <w:i/>
         </w:rPr>
-        <w:t>Puedes narrar en voz alta lo que vas escribiendo, por ejemplo: "Voy a crear un nuevo ticket: título 'impresora sin conexión', categoría hardware, prioridad alta, y lo envío."</w:t>
+        <w:t>"Voy a crear un nuevo ticket para simular un caso real de soporte: título 'impresora sin conexión en oficina 2', el nombre del solicitante, una breve descripción del problema, categoría hardware, y prioridad alta porque afecta el trabajo de una oficina completa. Al enviar el formulario, el navegador hace una petición POST a la API con estos datos en formato JSON."</w:t>
       </w:r>
     </w:p>
     <w:p>
@@ -1173,7 +1551,7 @@
         <w:rPr>
           <w:i/>
         </w:rPr>
-        <w:t>"Este ticket ya está guardado en MongoDB Atlas, en la nube."</w:t>
+        <w:t>"El sistema me redirige automáticamente a la Lista de tickets, y ahí está mi ticket recién creado, ya persistido en MongoDB Atlas. Si en este momento recargara la página, o incluso si la abriera desde otro dispositivo, el ticket seguiría ahí, porque no vive en la memoria del navegador sino en la base de datos en la nube."</w:t>
       </w:r>
     </w:p>
     <w:p>
@@ -1181,7 +1559,7 @@
         <w:rPr>
           <w:b/>
         </w:rPr>
-        <w:t>🗣️ QUÉ DECIR (al cambiar el estado y volver al Dashboard, pasos 6-7):</w:t>
+        <w:t>🗣️ QUÉ DECIR (al cambiar el estado, paso 6):</w:t>
       </w:r>
     </w:p>
     <w:p>
@@ -1192,7 +1570,26 @@
         <w:rPr>
           <w:i/>
         </w:rPr>
-        <w:t>"Como pueden ver, toda esta información se está guardando en tiempo real en MongoDB Atlas, y el servidor que la procesa está corriendo en Render — no hay nada corriendo en mi computadora."</w:t>
+        <w:t>"Ahora voy a simular que un técnico toma este ticket: cambio su estado de Abierto a En Progreso desde este mismo desplegable, sin recargar la página. Esto dispara una petición PUT a la API, que actualiza el documento en MongoDB, y el sistema me confirma el cambio con este mensaje."</w:t>
+      </w:r>
+    </w:p>
+    <w:p>
+      <w:r>
+        <w:rPr>
+          <w:b/>
+        </w:rPr>
+        <w:t>🗣️ QUÉ DECIR (al volver al Dashboard, paso 7):</w:t>
+      </w:r>
+    </w:p>
+    <w:p>
+      <w:pPr>
+        <w:ind w:left="400"/>
+      </w:pPr>
+      <w:r>
+        <w:rPr>
+          <w:i/>
+        </w:rPr>
+        <w:t>"Y si vuelvo al Dashboard, los contadores ya reflejan el cambio: bajó uno en 'Abiertos' y subió uno en 'En Progreso'. Todo esto está pasando en tiempo real, entre un frontend en Vercel, una API en Render y una base de datos en MongoDB Atlas — tres servicios distintos, en la nube, conversando entre sí por internet, sin que nada dependa de mi computadora."</w:t>
       </w:r>
     </w:p>
     <w:p>
@@ -1305,15 +1702,47 @@
         <w:rPr>
           <w:i/>
         </w:rPr>
-        <w:t>"El código está organizado en un único repositorio de GitHub con dos carpetas, backend y frontend, siguiendo un flujo de ramas con feature branches, develop y main. El backend está desplegado en Render, conectado a un cluster gratuito de MongoDB Atlas, y el frontend está desplegado como sitio estático en Vercel."</w:t>
+        <w:t>"El código está organizado en un único repositorio de GitHub, con dos carpetas principales: backend y frontend. Seguí un flujo de ramas tipo Git Flow: cada funcionalidad nueva la desarrollé en una rama feature, por ejemplo feature/backend-api o feature/frontend-spa; esas ramas se integran a develop, que es la rama de trabajo activa; y develop se fusiona a main, que es la rama estable, la que efectivamente se despliega en producción. Esto se refleja en el historial de commits, con mensajes descriptivos siguiendo la convención de commits convencionales.</w:t>
       </w:r>
     </w:p>
     <w:p>
+      <w:r>
+        <w:t>&gt;</w:t>
+      </w:r>
+    </w:p>
+    <w:p>
+      <w:pPr>
+        <w:ind w:left="400"/>
+      </w:pPr>
+      <w:r>
+        <w:rPr>
+          <w:i/>
+        </w:rPr>
+        <w:t>El backend está desplegado en Render como un Web Service gratuito, apuntando directamente a este repositorio y a la carpeta backend; configuré ahí la variable de entorno MONGODB_URI para que se conecte a mi cluster de MongoDB Atlas. Pueden ver que el estado del servicio dice 'Live'.</w:t>
+      </w:r>
+    </w:p>
+    <w:p>
+      <w:r>
+        <w:t>&gt;</w:t>
+      </w:r>
+    </w:p>
+    <w:p>
+      <w:pPr>
+        <w:ind w:left="400"/>
+      </w:pPr>
+      <w:r>
+        <w:rPr>
+          <w:i/>
+        </w:rPr>
+        <w:t>Y el frontend está desplegado en Vercel como un sitio estático, apuntando a la carpeta frontend del mismo repositorio; cada vez que hago push a la rama main, Vercel vuelve a desplegar automáticamente la última versión."</w:t>
+      </w:r>
+    </w:p>
+    <w:p>
       <w:pPr>
         <w:pStyle w:val="Heading2"/>
       </w:pPr>
       <w:r>
-        <w:t>6. Cierre (20-30 seg)</w:t>
+        <w:t>5.1. Retos, pruebas y aprendizajes (1 min) — sección extra recomendada</w:t>
       </w:r>
     </w:p>
     <w:p>
@@ -1329,7 +1758,7 @@
         <w:pStyle w:val="ListBullet"/>
       </w:pPr>
       <w:r>
-        <w:t>Vuelve a mostrar tu rostro en pantalla completa (cierra o minimiza las ventanas de código/navegador).</w:t>
+        <w:t>Puedes volver a hablar a cámara, o mostrar de nuevo brevemente la pestaña de Render/logs si quieres reforzar visualmente.</w:t>
       </w:r>
     </w:p>
     <w:p>
@@ -1348,7 +1777,114 @@
         <w:rPr>
           <w:i/>
         </w:rPr>
-        <w:t>"Con esto concluyo la sustentación de la Actividad #9. El sistema completo — frontend, backend y base de datos — está funcionando de manera integrada y desplegado en la nube, cumpliendo con los requisitos de la actividad. Muchas gracias."</w:t>
+        <w:t>"Durante el desarrollo enfrenté algunos retos típicos de un despliegue full stack real. Por ejemplo, tuve que asegurarme de habilitar CORS correctamente en el backend, porque el navegador bloquea por defecto las peticiones entre dominios distintos — el frontend en Vercel y la API en Render son dominios diferentes. También tuve que configurar la lista de acceso de red en MongoDB Atlas para permitir conexiones desde Render, ya que por defecto solo permite la IP desde donde se creó el cluster.</w:t>
+      </w:r>
+    </w:p>
+    <w:p>
+      <w:r>
+        <w:t>&gt;</w:t>
+      </w:r>
+    </w:p>
+    <w:p>
+      <w:pPr>
+        <w:ind w:left="400"/>
+      </w:pPr>
+      <w:r>
+        <w:rPr>
+          <w:i/>
+        </w:rPr>
+        <w:t>Para probar la API antes de conectarla al frontend, primero la validé de forma local, verificando cada endpoint con datos de prueba, y luego repetí esas mismas pruebas ya contra la URL pública en Render, para confirmar que el comportamiento fuera idéntico en producción.</w:t>
+      </w:r>
+    </w:p>
+    <w:p>
+      <w:r>
+        <w:t>&gt;</w:t>
+      </w:r>
+    </w:p>
+    <w:p>
+      <w:pPr>
+        <w:ind w:left="400"/>
+      </w:pPr>
+      <w:r>
+        <w:rPr>
+          <w:i/>
+        </w:rPr>
+        <w:t>Este proceso me permitió entender de forma práctica conceptos que solo había visto en teoría: la diferencia entre un entorno de desarrollo y uno de producción, la importancia de las variables de entorno para no exponer credenciales, y cómo coordinar el despliegue de múltiples servicios independientes que deben funcionar como un solo sistema."</w:t>
+      </w:r>
+    </w:p>
+    <w:p>
+      <w:pPr>
+        <w:pStyle w:val="Heading2"/>
+      </w:pPr>
+      <w:r>
+        <w:t>6. Cierre (30-40 seg)</w:t>
+      </w:r>
+    </w:p>
+    <w:p>
+      <w:r>
+        <w:rPr>
+          <w:b/>
+        </w:rPr>
+        <w:t>🎬 QUÉ HACER:</w:t>
+      </w:r>
+    </w:p>
+    <w:p>
+      <w:pPr>
+        <w:pStyle w:val="ListBullet"/>
+      </w:pPr>
+      <w:r>
+        <w:t>Vuelve a mostrar tu rostro en pantalla completa (cierra o minimiza las ventanas de código/navegador).</w:t>
+      </w:r>
+    </w:p>
+    <w:p>
+      <w:r>
+        <w:rPr>
+          <w:b/>
+        </w:rPr>
+        <w:t>🗣️ QUÉ DECIR:</w:t>
+      </w:r>
+    </w:p>
+    <w:p>
+      <w:pPr>
+        <w:ind w:left="400"/>
+      </w:pPr>
+      <w:r>
+        <w:rPr>
+          <w:i/>
+        </w:rPr>
+        <w:t>"Con esto concluyo la sustentación de la Actividad número 9. A lo largo del video mostré la arquitectura del sistema, el código del backend y del frontend, una demostración en vivo del sistema funcionando en internet, y la infraestructura donde está desplegado.</w:t>
+      </w:r>
+    </w:p>
+    <w:p>
+      <w:r>
+        <w:t>&gt;</w:t>
+      </w:r>
+    </w:p>
+    <w:p>
+      <w:pPr>
+        <w:ind w:left="400"/>
+      </w:pPr>
+      <w:r>
+        <w:rPr>
+          <w:i/>
+        </w:rPr>
+        <w:t>El resultado es un sistema completo — frontend, backend y base de datos — funcionando de manera integrada, desplegado en la nube y operativo sin depender de servidores locales, cumpliendo con todos los requisitos de la actividad y cerrando el proyecto semestral de Desarrollo de Sistemas Informáticos.</w:t>
+      </w:r>
+    </w:p>
+    <w:p>
+      <w:r>
+        <w:t>&gt;</w:t>
+      </w:r>
+    </w:p>
+    <w:p>
+      <w:pPr>
+        <w:ind w:left="400"/>
+      </w:pPr>
+      <w:r>
+        <w:rPr>
+          <w:i/>
+        </w:rPr>
+        <w:t>Muchas gracias por su atención."</w:t>
       </w:r>
     </w:p>
     <w:p>

</xml_diff>